<commit_message>
chore: Jesica actualiza Manual Calificaciones Primario 2026 (rol Direccion de Area / Supervisor)
</commit_message>
<xml_diff>
--- a/public/manuales/Manual_Calificaciones_Primario_2026.docx
+++ b/public/manuales/Manual_Calificaciones_Primario_2026.docx
@@ -1080,7 +1080,7 @@
                 <w:sz w:val="18"/>
                 <w:szCs w:val="18"/>
               </w:rPr>
-              <w:t>Dirección de Área</w:t>
+              <w:t>Dirección de Área / Supervisor</w:t>
             </w:r>
           </w:p>
         </w:tc>
@@ -1313,25 +1313,7 @@
                 <w:sz w:val="18"/>
                 <w:szCs w:val="18"/>
               </w:rPr>
-              <w:t>Primer período de carga. Habilita todas las solapas para la g</w:t>
-            </w:r>
-            <w:r>
-              <w:rPr>
-                <w:rFonts w:ascii="Archivo" w:eastAsia="Archivo" w:hAnsi="Archivo" w:cs="Archivo"/>
-                <w:color w:val="222222"/>
-                <w:sz w:val="18"/>
-                <w:szCs w:val="18"/>
-              </w:rPr>
-              <w:t>eneración del boletín 1er bimestre (calificaciones conceptuales)</w:t>
-            </w:r>
-            <w:r>
-              <w:rPr>
-                <w:rFonts w:ascii="Archivo" w:eastAsia="Archivo" w:hAnsi="Archivo" w:cs="Archivo"/>
-                <w:color w:val="222222"/>
-                <w:sz w:val="18"/>
-                <w:szCs w:val="18"/>
-              </w:rPr>
-              <w:t>.</w:t>
+              <w:t>Primer período de carga. Habilita todas las solapas para la generación del boletín 1er bimestre (calificaciones conceptuales).</w:t>
             </w:r>
           </w:p>
         </w:tc>
@@ -1390,16 +1372,7 @@
                 <w:sz w:val="18"/>
                 <w:szCs w:val="18"/>
               </w:rPr>
-              <w:t>Segundo período del año.</w:t>
-            </w:r>
-            <w:r>
-              <w:rPr>
-                <w:rFonts w:ascii="Archivo" w:eastAsia="Archivo" w:hAnsi="Archivo" w:cs="Archivo"/>
-                <w:color w:val="222222"/>
-                <w:sz w:val="18"/>
-                <w:szCs w:val="18"/>
-              </w:rPr>
-              <w:t xml:space="preserve"> Boletín 1er cuatrimestre</w:t>
+              <w:t xml:space="preserve">Segundo período del año. Boletín 1er cuatrimestre</w:t>
             </w:r>
           </w:p>
         </w:tc>
@@ -1458,16 +1431,7 @@
                 <w:sz w:val="18"/>
                 <w:szCs w:val="18"/>
               </w:rPr>
-              <w:t>Tercer período del año.</w:t>
-            </w:r>
-            <w:r>
-              <w:rPr>
-                <w:rFonts w:ascii="Archivo" w:eastAsia="Archivo" w:hAnsi="Archivo" w:cs="Archivo"/>
-                <w:color w:val="222222"/>
-                <w:sz w:val="18"/>
-                <w:szCs w:val="18"/>
-              </w:rPr>
-              <w:t xml:space="preserve"> (calificaciones conceptuales)</w:t>
+              <w:t xml:space="preserve">Tercer período del año. (calificaciones conceptuales)</w:t>
             </w:r>
           </w:p>
         </w:tc>
@@ -1526,25 +1490,7 @@
                 <w:sz w:val="18"/>
                 <w:szCs w:val="18"/>
               </w:rPr>
-              <w:t>Cuarto bimestre</w:t>
-            </w:r>
-            <w:r>
-              <w:rPr>
-                <w:rFonts w:ascii="Archivo" w:eastAsia="Archivo" w:hAnsi="Archivo" w:cs="Archivo"/>
-                <w:color w:val="222222"/>
-                <w:sz w:val="18"/>
-                <w:szCs w:val="18"/>
-              </w:rPr>
-              <w:t>.</w:t>
-            </w:r>
-            <w:r>
-              <w:rPr>
-                <w:rFonts w:ascii="Archivo" w:eastAsia="Archivo" w:hAnsi="Archivo" w:cs="Archivo"/>
-                <w:color w:val="222222"/>
-                <w:sz w:val="18"/>
-                <w:szCs w:val="18"/>
-              </w:rPr>
-              <w:t xml:space="preserve"> Boletín 2do cuatrimestre</w:t>
+              <w:t xml:space="preserve">Cuarto bimestre. Boletín 2do cuatrimestre</w:t>
             </w:r>
           </w:p>
         </w:tc>
@@ -2078,7 +2024,6 @@
         <w:spacing w:before="120" w:after="120"/>
         <w:ind w:left="400"/>
       </w:pPr>
-      <w:proofErr w:type="gramStart"/>
       <w:r>
         <w:rPr>
           <w:rFonts w:ascii="Archivo" w:eastAsia="Archivo" w:hAnsi="Archivo" w:cs="Archivo"/>
@@ -2088,19 +2033,7 @@
           <w:sz w:val="18"/>
           <w:szCs w:val="18"/>
         </w:rPr>
-        <w:t>ℹ  La</w:t>
-      </w:r>
-      <w:proofErr w:type="gramEnd"/>
-      <w:r>
-        <w:rPr>
-          <w:rFonts w:ascii="Archivo" w:eastAsia="Archivo" w:hAnsi="Archivo" w:cs="Archivo"/>
-          <w:i/>
-          <w:iCs/>
-          <w:color w:val="0D6B5E"/>
-          <w:sz w:val="18"/>
-          <w:szCs w:val="18"/>
-        </w:rPr>
-        <w:t xml:space="preserve"> lista desplegable de Sección solo se habilita después de seleccionar el grado. Usar primero el filtro de grado y luego el de sección.</w:t>
+        <w:t xml:space="preserve">ℹ  La lista desplegable de Sección solo se habilita después de seleccionar el grado. Usar primero el filtro de grado y luego el de sección.</w:t>
       </w:r>
     </w:p>
     <w:p/>
@@ -2230,21 +2163,7 @@
           <w:rFonts w:ascii="Archivo" w:eastAsia="Archivo" w:hAnsi="Archivo" w:cs="Archivo"/>
           <w:color w:val="222222"/>
         </w:rPr>
-        <w:t>Al hacer clic en el ícono de edición de un estudiante, se abre el panel de carga organizado en solapas. En el Nivel Primario, todas las solapas son completadas por el Maestro de grado. Si el rol está asociado a una sección de Jornada Extendida, aparece una solapa adicional</w:t>
-      </w:r>
-      <w:r>
-        <w:rPr>
-          <w:rFonts w:ascii="Archivo" w:eastAsia="Archivo" w:hAnsi="Archivo" w:cs="Archivo"/>
-          <w:color w:val="222222"/>
-        </w:rPr>
-        <w:t xml:space="preserve"> (2do y 4to bimestre)</w:t>
-      </w:r>
-      <w:r>
-        <w:rPr>
-          <w:rFonts w:ascii="Archivo" w:eastAsia="Archivo" w:hAnsi="Archivo" w:cs="Archivo"/>
-          <w:color w:val="222222"/>
-        </w:rPr>
-        <w:t>.</w:t>
+        <w:t xml:space="preserve">Al hacer clic en el ícono de edición de un estudiante, se abre el panel de carga organizado en solapas. En el Nivel Primario, todas las solapas son completadas por el Maestro de grado. Si el rol está asociado a una sección de Jornada Extendida, aparece una solapa adicional (2do y 4to bimestre).</w:t>
       </w:r>
     </w:p>
     <w:p/>
@@ -3185,7 +3104,6 @@
         <w:spacing w:before="120" w:after="120"/>
         <w:ind w:left="400"/>
       </w:pPr>
-      <w:proofErr w:type="gramStart"/>
       <w:r>
         <w:rPr>
           <w:rFonts w:ascii="Archivo" w:eastAsia="Archivo" w:hAnsi="Archivo" w:cs="Archivo"/>
@@ -3195,19 +3113,7 @@
           <w:sz w:val="18"/>
           <w:szCs w:val="18"/>
         </w:rPr>
-        <w:t>ℹ  El</w:t>
-      </w:r>
-      <w:proofErr w:type="gramEnd"/>
-      <w:r>
-        <w:rPr>
-          <w:rFonts w:ascii="Archivo" w:eastAsia="Archivo" w:hAnsi="Archivo" w:cs="Archivo"/>
-          <w:i/>
-          <w:iCs/>
-          <w:color w:val="0D6B5E"/>
-          <w:sz w:val="18"/>
-          <w:szCs w:val="18"/>
-        </w:rPr>
-        <w:t xml:space="preserve"> ícono de información (i) junto a cada calificación muestra los descriptores detallados. El botón «Ver rúbrica» permite consultar la rúbrica completa de evaluación de cada asignatura.</w:t>
+        <w:t xml:space="preserve">ℹ  El ícono de información (i) junto a cada calificación muestra los descriptores detallados. El botón «Ver rúbrica» permite consultar la rúbrica completa de evaluación de cada asignatura.</w:t>
       </w:r>
     </w:p>
     <w:p/>
@@ -3350,7 +3256,6 @@
         <w:spacing w:before="140"/>
         <w:ind w:left="360"/>
       </w:pPr>
-      <w:proofErr w:type="gramStart"/>
       <w:r>
         <w:rPr>
           <w:rFonts w:ascii="Archivo" w:eastAsia="Archivo" w:hAnsi="Archivo" w:cs="Archivo"/>
@@ -3360,19 +3265,7 @@
           <w:sz w:val="18"/>
           <w:szCs w:val="18"/>
         </w:rPr>
-        <w:t>🔎  ¿</w:t>
-      </w:r>
-      <w:proofErr w:type="gramEnd"/>
-      <w:r>
-        <w:rPr>
-          <w:rFonts w:ascii="Archivo" w:eastAsia="Archivo" w:hAnsi="Archivo" w:cs="Archivo"/>
-          <w:b/>
-          <w:bCs/>
-          <w:color w:val="073244"/>
-          <w:sz w:val="18"/>
-          <w:szCs w:val="18"/>
-        </w:rPr>
-        <w:t>Qué debe completarse para todos los estudiantes?</w:t>
+        <w:t>🔎  ¿Qué debe completarse para todos los estudiantes?</w:t>
       </w:r>
     </w:p>
     <w:p>
@@ -3675,7 +3568,6 @@
         <w:spacing w:before="120" w:after="120"/>
         <w:ind w:left="400"/>
       </w:pPr>
-      <w:proofErr w:type="gramStart"/>
       <w:r>
         <w:rPr>
           <w:rFonts w:ascii="Archivo" w:eastAsia="Archivo" w:hAnsi="Archivo" w:cs="Archivo"/>
@@ -3685,19 +3577,7 @@
           <w:sz w:val="18"/>
           <w:szCs w:val="18"/>
         </w:rPr>
-        <w:t>⚠  Si</w:t>
-      </w:r>
-      <w:proofErr w:type="gramEnd"/>
-      <w:r>
-        <w:rPr>
-          <w:rFonts w:ascii="Archivo" w:eastAsia="Archivo" w:hAnsi="Archivo" w:cs="Archivo"/>
-          <w:i/>
-          <w:iCs/>
-          <w:color w:val="B8600B"/>
-          <w:sz w:val="18"/>
-          <w:szCs w:val="18"/>
-        </w:rPr>
-        <w:t xml:space="preserve"> el campo «¿Tiene PPI?» no está completado para algún estudiante, el sistema no permitirá cerrar las calificaciones de la sección.</w:t>
+        <w:t xml:space="preserve">⚠  Si el campo «¿Tiene PPI?» no está completado para algún estudiante, el sistema no permitirá cerrar las calificaciones de la sección.</w:t>
       </w:r>
     </w:p>
     <w:p/>
@@ -4198,7 +4078,6 @@
         <w:spacing w:before="140"/>
         <w:ind w:left="360"/>
       </w:pPr>
-      <w:proofErr w:type="gramStart"/>
       <w:r>
         <w:rPr>
           <w:rFonts w:ascii="Archivo" w:eastAsia="Archivo" w:hAnsi="Archivo" w:cs="Archivo"/>
@@ -4208,19 +4087,7 @@
           <w:sz w:val="18"/>
           <w:szCs w:val="18"/>
         </w:rPr>
-        <w:t>🔎  Cerrar</w:t>
-      </w:r>
-      <w:proofErr w:type="gramEnd"/>
-      <w:r>
-        <w:rPr>
-          <w:rFonts w:ascii="Archivo" w:eastAsia="Archivo" w:hAnsi="Archivo" w:cs="Archivo"/>
-          <w:b/>
-          <w:bCs/>
-          <w:color w:val="073244"/>
-          <w:sz w:val="18"/>
-          <w:szCs w:val="18"/>
-        </w:rPr>
-        <w:t xml:space="preserve"> calificaciones es una acción crítica</w:t>
+        <w:t xml:space="preserve">🔎  Cerrar calificaciones es una acción crítica</w:t>
       </w:r>
     </w:p>
     <w:p>
@@ -4357,7 +4224,6 @@
         <w:spacing w:before="120" w:after="120"/>
         <w:ind w:left="400"/>
       </w:pPr>
-      <w:proofErr w:type="gramStart"/>
       <w:r>
         <w:rPr>
           <w:rFonts w:ascii="Archivo" w:eastAsia="Archivo" w:hAnsi="Archivo" w:cs="Archivo"/>
@@ -4367,19 +4233,7 @@
           <w:sz w:val="18"/>
           <w:szCs w:val="18"/>
         </w:rPr>
-        <w:t>⚠  Los</w:t>
-      </w:r>
-      <w:proofErr w:type="gramEnd"/>
-      <w:r>
-        <w:rPr>
-          <w:rFonts w:ascii="Archivo" w:eastAsia="Archivo" w:hAnsi="Archivo" w:cs="Archivo"/>
-          <w:i/>
-          <w:iCs/>
-          <w:color w:val="B8600B"/>
-          <w:sz w:val="18"/>
-          <w:szCs w:val="18"/>
-        </w:rPr>
-        <w:t xml:space="preserve"> boletines solo pueden generarse cuando todas las calificaciones de la sección están en estado Calificado (cerradas). Si algún estudiante está En proceso o No calificado, el sistema no habilitará la generación.</w:t>
+        <w:t xml:space="preserve">⚠  Los boletines solo pueden generarse cuando todas las calificaciones de la sección están en estado Calificado (cerradas). Si algún estudiante está En proceso o No calificado, el sistema no habilitará la generación.</w:t>
       </w:r>
     </w:p>
     <w:p/>
@@ -4677,7 +4531,7 @@
                 <w:sz w:val="18"/>
                 <w:szCs w:val="18"/>
               </w:rPr>
-              <w:t>Dirección de Área</w:t>
+              <w:t>Dirección de Área / Supervisor</w:t>
             </w:r>
           </w:p>
         </w:tc>
@@ -4719,7 +4573,6 @@
         <w:spacing w:before="120" w:after="120"/>
         <w:ind w:left="400"/>
       </w:pPr>
-      <w:proofErr w:type="gramStart"/>
       <w:r>
         <w:rPr>
           <w:rFonts w:ascii="Archivo" w:eastAsia="Archivo" w:hAnsi="Archivo" w:cs="Archivo"/>
@@ -4729,19 +4582,7 @@
           <w:sz w:val="18"/>
           <w:szCs w:val="18"/>
         </w:rPr>
-        <w:t>ℹ  Al</w:t>
-      </w:r>
-      <w:proofErr w:type="gramEnd"/>
-      <w:r>
-        <w:rPr>
-          <w:rFonts w:ascii="Archivo" w:eastAsia="Archivo" w:hAnsi="Archivo" w:cs="Archivo"/>
-          <w:i/>
-          <w:iCs/>
-          <w:color w:val="0D6B5E"/>
-          <w:sz w:val="18"/>
-          <w:szCs w:val="18"/>
-        </w:rPr>
-        <w:t xml:space="preserve"> elevar un caso incluir: establecimiento, CUE, grado/sección, nombre y DNI del estudiante (si aplica), descripción del problema y capturas de pantalla.</w:t>
+        <w:t xml:space="preserve">ℹ  Al elevar un caso incluir: establecimiento, CUE, grado/sección, nombre y DNI del estudiante (si aplica), descripción del problema y capturas de pantalla.</w:t>
       </w:r>
     </w:p>
     <w:p/>

</xml_diff>